<commit_message>
Update Informe TPI - Reparaciones.docx
</commit_message>
<xml_diff>
--- a/Informe TPI - Reparaciones.docx
+++ b/Informe TPI - Reparaciones.docx
@@ -1,5 +1,5 @@
 
-<file path=word/document.xml><?xml version="1.0" encoding="utf-8"?>
+<file path=word\document.xml><?xml version="1.0" encoding="utf-8"?>
 <w:document xmlns:mc="http://schemas.openxmlformats.org/markup-compatibility/2006" xmlns:o="urn:schemas-microsoft-com:office:office" xmlns:r="http://schemas.openxmlformats.org/officeDocument/2006/relationships" xmlns:m="http://schemas.openxmlformats.org/officeDocument/2006/math" xmlns:v="urn:schemas-microsoft-com:vml" xmlns:wp="http://schemas.openxmlformats.org/drawingml/2006/wordprocessingDrawing" xmlns:w10="urn:schemas-microsoft-com:office:word" xmlns:w="http://schemas.openxmlformats.org/wordprocessingml/2006/main" xmlns:wne="http://schemas.microsoft.com/office/word/2006/wordml" xmlns:sl="http://schemas.openxmlformats.org/schemaLibrary/2006/main" xmlns:a="http://schemas.openxmlformats.org/drawingml/2006/main" xmlns:pic="http://schemas.openxmlformats.org/drawingml/2006/picture" xmlns:c="http://schemas.openxmlformats.org/drawingml/2006/chart" xmlns:lc="http://schemas.openxmlformats.org/drawingml/2006/lockedCanvas" xmlns:dgm="http://schemas.openxmlformats.org/drawingml/2006/diagram" xmlns:wps="http://schemas.microsoft.com/office/word/2010/wordprocessingShape" xmlns:wpg="http://schemas.microsoft.com/office/word/2010/wordprocessingGroup" xmlns:w14="http://schemas.microsoft.com/office/word/2010/wordml" xmlns:w15="http://schemas.microsoft.com/office/word/2012/wordml" xmlns:w16="http://schemas.microsoft.com/office/word/2018/wordml" xmlns:w16cex="http://schemas.microsoft.com/office/word/2018/wordml/cex" xmlns:w16cid="http://schemas.microsoft.com/office/word/2016/wordml/cid" xmlns="http://schemas.microsoft.com/office/tasks/2019/documenttasks" xmlns:cr="http://schemas.microsoft.com/office/comments/2020/reactions">
   <w:body>
     <w:p>
@@ -296,7 +296,7 @@
           <w:highlight w:val="white"/>
           <w:rtl w:val="0"/>
         </w:rPr>
-        <w:t xml:space="preserve">19/05/2026</w:t>
+        <w:t xml:space="preserve">09/06/2026</w:t>
       </w:r>
     </w:p>
     <w:p>
@@ -388,7 +388,7 @@
           <w:highlight w:val="white"/>
           <w:rtl w:val="0"/>
         </w:rPr>
-        <w:t xml:space="preserve">El sistema a desarrollar va a permitir gestionar las reparaciones de equipos informáticos. Registra clientes, equipos, órdenes de reparación y técnicos. Para esto contará con un menú principal y submenús que serán la interfaz gráfica. El sistema está orientado al uso por parte de los técnicos de la empresa, quienes deberán autenticarse con usuario y contraseña para acceder al sistema.</w:t>
+        <w:t xml:space="preserve">El sistema desarrollado permite gestionar las reparaciones de equipos informáticos de un taller. Registra clientes, equipos, reparaciones y técnicos operadores. La aplicación es de consola, con menú principal y submenús, utilizando la biblioteca rlutil para mejorar la presentación en pantalla. El acceso está restringido a técnicos, quienes deben autenticarse con usuario y contraseña. Si no existen técnicos registrados, el sistema permite crear el primero en el primer inicio y acceder automáticamente.</w:t>
       </w:r>
       <w:r>
         <w:rPr>
@@ -468,7 +468,7 @@
           <w:highlight w:val="white"/>
           <w:rtl w:val="0"/>
         </w:rPr>
-        <w:t xml:space="preserve">El objetivo principal del programa es llevar el control de las órdenes de reparación de equipos informáticos. Las órdenes registran el equipo a reparar, el cliente que lo entrega, fecha de ingreso y entrega estimada y el estado de la reparación.</w:t>
+        <w:t xml:space="preserve">El objetivo principal del programa es llevar el control de las reparaciones de equipos informáticos. Cada reparación registra el equipo asociado (por ID), las fechas de ingreso y egreso, el importe y el estado de la reparación (1: en proceso; 2: reparado; 3: no reparado). Los datos se almacenan en archivos binarios (.dat) mediante fwrite/fread.</w:t>
       </w:r>
     </w:p>
     <w:p>
@@ -488,7 +488,7 @@
           <w:highlight w:val="white"/>
           <w:rtl w:val="0"/>
         </w:rPr>
-        <w:t xml:space="preserve">El sistema va a permitir registrar a los clientes, que entregarán los equipos para su reparación. De cada cliente se registrará un ID único, el DNI/CUIT, apellido, nombre, domicilio, teléfono, email y tipo de cliente, el sistema contempla la baja lógica del cliente.</w:t>
+        <w:t xml:space="preserve">El sistema permite registrar clientes que entregan equipos para su reparación. De cada cliente se registra un ID autogenerado, CUIT, nombre, apellido (vacío en empresas), teléfono, email, dirección y tipo de cliente (1: particular; 2: empresa). La clase Cliente hereda de Persona. El sistema contempla baja lógica mediante el atributo _estado.</w:t>
       </w:r>
     </w:p>
     <w:p>
@@ -508,7 +508,7 @@
           <w:highlight w:val="white"/>
           <w:rtl w:val="0"/>
         </w:rPr>
-        <w:t xml:space="preserve">Los equipos serán registrados con un número de equipo (ID único), una descripción del mismo, marca, modelo y el tipo de equipo (PC, notebook, impresora, etc.). Cada equipo estará asociado a un cliente y a un técnico. También se incluirá la fecha de ingreso y baja lógica.</w:t>
+        <w:t xml:space="preserve">Los equipos se registran con ID autogenerado, descripción, marca, tipo de equipo (PC, notebook, impresora, periférico, etc.), fecha de ingreso, ID de cliente e ID de técnico asignado. La validación verifica que existan el cliente y el técnico antes de dar de alta el equipo. También contempla baja lógica.</w:t>
       </w:r>
     </w:p>
     <w:p>
@@ -528,7 +528,7 @@
           <w:highlight w:val="white"/>
           <w:rtl w:val="0"/>
         </w:rPr>
-        <w:t xml:space="preserve">Las reparaciones serán registradas con su propio ID único, el cliente al que pertenece, fecha de ingreso, fecha de egreso, importe y estado de la reparación (pendiente, en proceso, finalizada o sin reparación). El sistema contempla la baja lógica de la reparación.</w:t>
+        <w:t xml:space="preserve">Las reparaciones se registran con ID autogenerado, ID de equipo, fecha de ingreso, fecha de egreso, importe y estado de reparación (1: en proceso; 2: reparado; 3: no reparado). El cliente se obtiene indirectamente a través del equipo asociado. El sistema permite actualizar el estado de la reparación y contempla baja lógica del registro.</w:t>
       </w:r>
     </w:p>
     <w:p>
@@ -548,7 +548,7 @@
           <w:highlight w:val="white"/>
           <w:rtl w:val="0"/>
         </w:rPr>
-        <w:t xml:space="preserve">Los técnicos son quienes operan el sistema. Cada técnico tendrá un ID único, usuario y contraseña para autenticarse, además de los datos personales heredados de la clase Persona (CUIT, nombre y apellido).</w:t>
+        <w:t xml:space="preserve">Los técnicos son quienes operan el sistema. Cada técnico tiene ID autogenerado, usuario (único en el sistema), contraseña, nombre y apellido heredados de Persona. No se exige CUIT para técnicos. El login valida credenciales contra el archivo tecnicos.dat.</w:t>
       </w:r>
     </w:p>
     <w:p>
@@ -568,7 +568,7 @@
           <w:highlight w:val="white"/>
           <w:rtl w:val="0"/>
         </w:rPr>
-        <w:t xml:space="preserve">El sistema permitirá realizar búsquedas de órdenes por cliente, por equipo y por rango de fechas.</w:t>
+        <w:t xml:space="preserve">El sistema permite buscar registros por ID en cada módulo (clientes, equipos, reparaciones y técnicos) y generar informes filtrados por cliente, técnico, rango de fechas, estado de reparación y tipo de equipo.</w:t>
       </w:r>
       <w:r>
         <w:rPr>
@@ -699,7 +699,7 @@
           <w:highlight w:val="white"/>
           <w:rtl w:val="0"/>
         </w:rPr>
-        <w:t xml:space="preserve">Ordenados por apellido/nombre</w:t>
+        <w:t xml:space="preserve">Solo registros activos</w:t>
       </w:r>
     </w:p>
     <w:p>
@@ -723,7 +723,7 @@
           <w:highlight w:val="white"/>
           <w:rtl w:val="0"/>
         </w:rPr>
-        <w:t xml:space="preserve">Ordenados por tipo de cliente (particular/empresa)</w:t>
+        <w:t xml:space="preserve">Visualización diferenciada: particular o empresa (razón social)</w:t>
       </w:r>
     </w:p>
     <w:p>
@@ -771,7 +771,7 @@
           <w:highlight w:val="white"/>
           <w:rtl w:val="0"/>
         </w:rPr>
-        <w:t xml:space="preserve">Ordenados por fecha de ingreso</w:t>
+        <w:t xml:space="preserve">Muestra fecha de ingreso del equipo</w:t>
       </w:r>
     </w:p>
     <w:p>
@@ -795,7 +795,7 @@
           <w:highlight w:val="white"/>
           <w:rtl w:val="0"/>
         </w:rPr>
-        <w:t xml:space="preserve">Ordenados por tipo de equipo</w:t>
+        <w:t xml:space="preserve">Incluye marca, tipo, cliente y técnico (por ID)</w:t>
       </w:r>
     </w:p>
     <w:p>
@@ -819,7 +819,7 @@
           <w:highlight w:val="white"/>
           <w:rtl w:val="0"/>
         </w:rPr>
-        <w:t xml:space="preserve">Ordenados por marca</w:t>
+        <w:t xml:space="preserve">Listado de equipos activos</w:t>
       </w:r>
     </w:p>
     <w:p>
@@ -867,7 +867,7 @@
           <w:highlight w:val="white"/>
           <w:rtl w:val="0"/>
         </w:rPr>
-        <w:t xml:space="preserve">Ordenadas por fecha de entrega</w:t>
+        <w:t xml:space="preserve">Muestra fechas, importe y estado de reparación</w:t>
       </w:r>
     </w:p>
     <w:p>
@@ -891,7 +891,7 @@
           <w:highlight w:val="white"/>
           <w:rtl w:val="0"/>
         </w:rPr>
-        <w:t xml:space="preserve">Ordenadas por estado</w:t>
+        <w:t xml:space="preserve">Permite actualizar estadoRep (1, 2 o 3)</w:t>
       </w:r>
     </w:p>
     <w:p>
@@ -939,7 +939,7 @@
           <w:highlight w:val="white"/>
           <w:rtl w:val="0"/>
         </w:rPr>
-        <w:t xml:space="preserve">Ordenados por apellido/nombre</w:t>
+        <w:t xml:space="preserve">Solo registros activos</w:t>
       </w:r>
     </w:p>
     <w:p>
@@ -1026,7 +1026,7 @@
           <w:highlight w:val="white"/>
           <w:rtl w:val="0"/>
         </w:rPr>
-        <w:t xml:space="preserve">Por CUIT</w:t>
+        <w:t xml:space="preserve">Por ID de cliente</w:t>
       </w:r>
     </w:p>
     <w:p>
@@ -1050,7 +1050,7 @@
           <w:highlight w:val="white"/>
           <w:rtl w:val="0"/>
         </w:rPr>
-        <w:t xml:space="preserve">Por tipo de cliente (particular o empresa)</w:t>
+        <w:t xml:space="preserve">Alta, listado y baja lógica de clientes</w:t>
       </w:r>
     </w:p>
     <w:p>
@@ -1074,7 +1074,7 @@
           <w:highlight w:val="white"/>
           <w:rtl w:val="0"/>
         </w:rPr>
-        <w:t xml:space="preserve">Consulta de equipos</w:t>
+        <w:t xml:space="preserve">Consulta de equipos (ABM)</w:t>
       </w:r>
     </w:p>
     <w:p>
@@ -1098,7 +1098,7 @@
           <w:highlight w:val="white"/>
           <w:rtl w:val="0"/>
         </w:rPr>
-        <w:t xml:space="preserve">Por tipo de equipo</w:t>
+        <w:t xml:space="preserve">Por ID de equipo</w:t>
       </w:r>
     </w:p>
     <w:p>
@@ -1122,7 +1122,7 @@
           <w:highlight w:val="white"/>
           <w:rtl w:val="0"/>
         </w:rPr>
-        <w:t xml:space="preserve">Por marca</w:t>
+        <w:t xml:space="preserve">Alta, listado y baja lógica de equipos</w:t>
       </w:r>
     </w:p>
     <w:p>
@@ -1146,7 +1146,7 @@
           <w:highlight w:val="white"/>
           <w:rtl w:val="0"/>
         </w:rPr>
-        <w:t xml:space="preserve">Por cliente</w:t>
+        <w:t xml:space="preserve">Asociación a cliente y técnico por ID</w:t>
       </w:r>
     </w:p>
     <w:p>
@@ -1170,7 +1170,7 @@
           <w:highlight w:val="white"/>
           <w:rtl w:val="0"/>
         </w:rPr>
-        <w:t xml:space="preserve">Consulta de reparaciones</w:t>
+        <w:t xml:space="preserve">Consulta de reparaciones (ABM)</w:t>
       </w:r>
     </w:p>
     <w:p>
@@ -1194,7 +1194,7 @@
           <w:highlight w:val="white"/>
           <w:rtl w:val="0"/>
         </w:rPr>
-        <w:t xml:space="preserve">Por cliente</w:t>
+        <w:t xml:space="preserve">Por ID de reparación</w:t>
       </w:r>
     </w:p>
     <w:p>
@@ -1218,7 +1218,7 @@
           <w:highlight w:val="white"/>
           <w:rtl w:val="0"/>
         </w:rPr>
-        <w:t xml:space="preserve">Por equipo</w:t>
+        <w:t xml:space="preserve">Por ID de equipo asociado</w:t>
       </w:r>
     </w:p>
     <w:p>
@@ -1242,7 +1242,7 @@
           <w:highlight w:val="white"/>
           <w:rtl w:val="0"/>
         </w:rPr>
-        <w:t xml:space="preserve">Por estado (pendiente, en proceso, finalizada, sin reparación)</w:t>
+        <w:t xml:space="preserve">Actualización de estado de reparación</w:t>
       </w:r>
     </w:p>
     <w:p>
@@ -1266,7 +1266,7 @@
           <w:highlight w:val="white"/>
           <w:rtl w:val="0"/>
         </w:rPr>
-        <w:t xml:space="preserve">Por rango de fechas</w:t>
+        <w:t xml:space="preserve">Informe por rango de fechas de ingreso</w:t>
       </w:r>
     </w:p>
     <w:p>
@@ -1290,7 +1290,7 @@
           <w:highlight w:val="white"/>
           <w:rtl w:val="0"/>
         </w:rPr>
-        <w:t xml:space="preserve">Consulta de técnicos</w:t>
+        <w:t xml:space="preserve">Consulta de técnicos (ABM)</w:t>
       </w:r>
     </w:p>
     <w:p>
@@ -1314,7 +1314,7 @@
           <w:highlight w:val="white"/>
           <w:rtl w:val="0"/>
         </w:rPr>
-        <w:t xml:space="preserve">Por usuario</w:t>
+        <w:t xml:space="preserve">Login con usuario y contraseña (validación en tecnicos.dat)</w:t>
       </w:r>
     </w:p>
     <w:p>
@@ -1377,7 +1377,7 @@
           <w:highlight w:val="white"/>
           <w:rtl w:val="0"/>
         </w:rPr>
-        <w:t xml:space="preserve">Facturación mensual de un año elegido</w:t>
+        <w:t xml:space="preserve">Reparaciones en proceso</w:t>
       </w:r>
     </w:p>
     <w:p>
@@ -1401,7 +1401,7 @@
           <w:highlight w:val="white"/>
           <w:rtl w:val="0"/>
         </w:rPr>
-        <w:t xml:space="preserve">Facturación anual (eligiendo el año)</w:t>
+        <w:t xml:space="preserve">Reparaciones por cliente</w:t>
       </w:r>
     </w:p>
     <w:p>
@@ -1425,7 +1425,7 @@
           <w:highlight w:val="white"/>
           <w:rtl w:val="0"/>
         </w:rPr>
-        <w:t xml:space="preserve">Cliente con mayor facturación histórica</w:t>
+        <w:t xml:space="preserve">Reparaciones por rango de fechas</w:t>
       </w:r>
     </w:p>
     <w:p>
@@ -1449,7 +1449,7 @@
           <w:highlight w:val="white"/>
           <w:rtl w:val="0"/>
         </w:rPr>
-        <w:t xml:space="preserve">Listado de clientes ordenados por facturación de menor a mayor</w:t>
+        <w:t xml:space="preserve">Total facturado (reparadas), equipos por tipo y reparaciones por técnico</w:t>
       </w:r>
       <w:r>
         <w:rPr>
@@ -1643,7 +1643,13 @@
 </w:document>
 </file>
 
-<file path=word/footer1.xml><?xml version="1.0" encoding="utf-8"?>
+<file path=word\fontTable.xml><?xml version="1.0" encoding="utf-8"?>
+<w:fonts xmlns:mc="http://schemas.openxmlformats.org/markup-compatibility/2006" xmlns:o="urn:schemas-microsoft-com:office:office" xmlns:r="http://schemas.openxmlformats.org/officeDocument/2006/relationships" xmlns:m="http://schemas.openxmlformats.org/officeDocument/2006/math" xmlns:v="urn:schemas-microsoft-com:vml" xmlns:wp="http://schemas.openxmlformats.org/drawingml/2006/wordprocessingDrawing" xmlns:w10="urn:schemas-microsoft-com:office:word" xmlns:w="http://schemas.openxmlformats.org/wordprocessingml/2006/main" xmlns:wne="http://schemas.microsoft.com/office/word/2006/wordml" xmlns:sl="http://schemas.openxmlformats.org/schemaLibrary/2006/main" xmlns:a="http://schemas.openxmlformats.org/drawingml/2006/main" xmlns:pic="http://schemas.openxmlformats.org/drawingml/2006/picture" xmlns:c="http://schemas.openxmlformats.org/drawingml/2006/chart" xmlns:lc="http://schemas.openxmlformats.org/drawingml/2006/lockedCanvas" xmlns:dgm="http://schemas.openxmlformats.org/drawingml/2006/diagram" xmlns:wps="http://schemas.microsoft.com/office/word/2010/wordprocessingShape" xmlns:wpg="http://schemas.microsoft.com/office/word/2010/wordprocessingGroup" xmlns:w14="http://schemas.microsoft.com/office/word/2010/wordml" xmlns:w15="http://schemas.microsoft.com/office/word/2012/wordml" xmlns:w16="http://schemas.microsoft.com/office/word/2018/wordml" xmlns:w16cex="http://schemas.microsoft.com/office/word/2018/wordml/cex" xmlns:w16cid="http://schemas.microsoft.com/office/word/2016/wordml/cid" xmlns="http://schemas.microsoft.com/office/tasks/2019/documenttasks" xmlns:cr="http://schemas.microsoft.com/office/comments/2020/reactions">
+  <w:font w:name="Arial"/>
+</w:fonts>
+</file>
+
+<file path=word\footer1.xml><?xml version="1.0" encoding="utf-8"?>
 <w:ftr xmlns:mc="http://schemas.openxmlformats.org/markup-compatibility/2006" xmlns:o="urn:schemas-microsoft-com:office:office" xmlns:r="http://schemas.openxmlformats.org/officeDocument/2006/relationships" xmlns:m="http://schemas.openxmlformats.org/officeDocument/2006/math" xmlns:v="urn:schemas-microsoft-com:vml" xmlns:wp="http://schemas.openxmlformats.org/drawingml/2006/wordprocessingDrawing" xmlns:w10="urn:schemas-microsoft-com:office:word" xmlns:w="http://schemas.openxmlformats.org/wordprocessingml/2006/main" xmlns:wne="http://schemas.microsoft.com/office/word/2006/wordml" xmlns:sl="http://schemas.openxmlformats.org/schemaLibrary/2006/main" xmlns:a="http://schemas.openxmlformats.org/drawingml/2006/main" xmlns:pic="http://schemas.openxmlformats.org/drawingml/2006/picture" xmlns:c="http://schemas.openxmlformats.org/drawingml/2006/chart" xmlns:lc="http://schemas.openxmlformats.org/drawingml/2006/lockedCanvas" xmlns:dgm="http://schemas.openxmlformats.org/drawingml/2006/diagram" xmlns:wps="http://schemas.microsoft.com/office/word/2010/wordprocessingShape" xmlns:wpg="http://schemas.microsoft.com/office/word/2010/wordprocessingGroup" xmlns:w14="http://schemas.microsoft.com/office/word/2010/wordml" xmlns:w15="http://schemas.microsoft.com/office/word/2012/wordml" xmlns:w16="http://schemas.microsoft.com/office/word/2018/wordml" xmlns:w16cex="http://schemas.microsoft.com/office/word/2018/wordml/cex" xmlns:w16cid="http://schemas.microsoft.com/office/word/2016/wordml/cid" xmlns="http://schemas.microsoft.com/office/tasks/2019/documenttasks" xmlns:cr="http://schemas.microsoft.com/office/comments/2020/reactions">
   <w:p>
     <w:pPr>
@@ -1675,7 +1681,7 @@
 </w:ftr>
 </file>
 
-<file path=word/footer2.xml><?xml version="1.0" encoding="utf-8"?>
+<file path=word\footer2.xml><?xml version="1.0" encoding="utf-8"?>
 <w:ftr xmlns:mc="http://schemas.openxmlformats.org/markup-compatibility/2006" xmlns:o="urn:schemas-microsoft-com:office:office" xmlns:r="http://schemas.openxmlformats.org/officeDocument/2006/relationships" xmlns:m="http://schemas.openxmlformats.org/officeDocument/2006/math" xmlns:v="urn:schemas-microsoft-com:vml" xmlns:wp="http://schemas.openxmlformats.org/drawingml/2006/wordprocessingDrawing" xmlns:w10="urn:schemas-microsoft-com:office:word" xmlns:w="http://schemas.openxmlformats.org/wordprocessingml/2006/main" xmlns:wne="http://schemas.microsoft.com/office/word/2006/wordml" xmlns:sl="http://schemas.openxmlformats.org/schemaLibrary/2006/main" xmlns:a="http://schemas.openxmlformats.org/drawingml/2006/main" xmlns:pic="http://schemas.openxmlformats.org/drawingml/2006/picture" xmlns:c="http://schemas.openxmlformats.org/drawingml/2006/chart" xmlns:lc="http://schemas.openxmlformats.org/drawingml/2006/lockedCanvas" xmlns:dgm="http://schemas.openxmlformats.org/drawingml/2006/diagram" xmlns:wps="http://schemas.microsoft.com/office/word/2010/wordprocessingShape" xmlns:wpg="http://schemas.microsoft.com/office/word/2010/wordprocessingGroup" xmlns:w14="http://schemas.microsoft.com/office/word/2010/wordml" xmlns:w15="http://schemas.microsoft.com/office/word/2012/wordml" xmlns:w16="http://schemas.microsoft.com/office/word/2018/wordml" xmlns:w16cex="http://schemas.microsoft.com/office/word/2018/wordml/cex" xmlns:w16cid="http://schemas.microsoft.com/office/word/2016/wordml/cid" xmlns="http://schemas.microsoft.com/office/tasks/2019/documenttasks" xmlns:cr="http://schemas.microsoft.com/office/comments/2020/reactions">
   <w:p>
     <w:pPr>
@@ -1690,7 +1696,7 @@
 </w:ftr>
 </file>
 
-<file path=word/numbering.xml><?xml version="1.0" encoding="utf-8"?>
+<file path=word\numbering.xml><?xml version="1.0" encoding="utf-8"?>
 <w:numbering xmlns:mc="http://schemas.openxmlformats.org/markup-compatibility/2006" xmlns:o="urn:schemas-microsoft-com:office:office" xmlns:r="http://schemas.openxmlformats.org/officeDocument/2006/relationships" xmlns:m="http://schemas.openxmlformats.org/officeDocument/2006/math" xmlns:v="urn:schemas-microsoft-com:vml" xmlns:wp="http://schemas.openxmlformats.org/drawingml/2006/wordprocessingDrawing" xmlns:w10="urn:schemas-microsoft-com:office:word" xmlns:w="http://schemas.openxmlformats.org/wordprocessingml/2006/main" xmlns:wne="http://schemas.microsoft.com/office/word/2006/wordml" xmlns:sl="http://schemas.openxmlformats.org/schemaLibrary/2006/main" xmlns:a="http://schemas.openxmlformats.org/drawingml/2006/main" xmlns:pic="http://schemas.openxmlformats.org/drawingml/2006/picture" xmlns:c="http://schemas.openxmlformats.org/drawingml/2006/chart" xmlns:lc="http://schemas.openxmlformats.org/drawingml/2006/lockedCanvas" xmlns:dgm="http://schemas.openxmlformats.org/drawingml/2006/diagram" xmlns:wps="http://schemas.microsoft.com/office/word/2010/wordprocessingShape" xmlns:wpg="http://schemas.microsoft.com/office/word/2010/wordprocessingGroup" xmlns:w14="http://schemas.microsoft.com/office/word/2010/wordml" xmlns:w15="http://schemas.microsoft.com/office/word/2012/wordml" xmlns:w16="http://schemas.microsoft.com/office/word/2018/wordml" xmlns:w16cex="http://schemas.microsoft.com/office/word/2018/wordml/cex" xmlns:w16cid="http://schemas.microsoft.com/office/word/2016/wordml/cid" xmlns="http://schemas.microsoft.com/office/tasks/2019/documenttasks" xmlns:cr="http://schemas.microsoft.com/office/comments/2020/reactions">
   <w:abstractNum w:abstractNumId="1">
     <w:lvl w:ilvl="0">
@@ -2034,7 +2040,18 @@
 </w:numbering>
 </file>
 
-<file path=word/styles.xml><?xml version="1.0" encoding="utf-8"?>
+<file path=word\settings.xml><?xml version="1.0" encoding="utf-8"?>
+<w:settings xmlns:mc="http://schemas.openxmlformats.org/markup-compatibility/2006" xmlns:o="urn:schemas-microsoft-com:office:office" xmlns:r="http://schemas.openxmlformats.org/officeDocument/2006/relationships" xmlns:m="http://schemas.openxmlformats.org/officeDocument/2006/math" xmlns:v="urn:schemas-microsoft-com:vml" xmlns:wp="http://schemas.openxmlformats.org/drawingml/2006/wordprocessingDrawing" xmlns:w10="urn:schemas-microsoft-com:office:word" xmlns:w="http://schemas.openxmlformats.org/wordprocessingml/2006/main" xmlns:wne="http://schemas.microsoft.com/office/word/2006/wordml" xmlns:sl="http://schemas.openxmlformats.org/schemaLibrary/2006/main" xmlns:a="http://schemas.openxmlformats.org/drawingml/2006/main" xmlns:pic="http://schemas.openxmlformats.org/drawingml/2006/picture" xmlns:c="http://schemas.openxmlformats.org/drawingml/2006/chart" xmlns:lc="http://schemas.openxmlformats.org/drawingml/2006/lockedCanvas" xmlns:dgm="http://schemas.openxmlformats.org/drawingml/2006/diagram" xmlns:wps="http://schemas.microsoft.com/office/word/2010/wordprocessingShape" xmlns:wpg="http://schemas.microsoft.com/office/word/2010/wordprocessingGroup" xmlns:w14="http://schemas.microsoft.com/office/word/2010/wordml" xmlns:w15="http://schemas.microsoft.com/office/word/2012/wordml" xmlns:w16="http://schemas.microsoft.com/office/word/2018/wordml" xmlns:w16cex="http://schemas.microsoft.com/office/word/2018/wordml/cex" xmlns:w16cid="http://schemas.microsoft.com/office/word/2016/wordml/cid" xmlns="http://schemas.microsoft.com/office/tasks/2019/documenttasks" xmlns:cr="http://schemas.microsoft.com/office/comments/2020/reactions">
+  <w:embedTrueTypeFonts w:val="1"/>
+  <w:defaultTabStop w:val="720"/>
+  <w:compat>
+    <w:compatSetting w:val="15" w:name="compatibilityMode" w:uri="http://schemas.microsoft.com/office/word"/>
+  </w:compat>
+  <w:clrSchemeMapping w:bg1="light1" w:t1="dark1" w:bg2="light2" w:t2="dark2" w:accent1="accent1" w:accent2="accent2" w:accent3="accent3" w:accent4="accent4" w:accent5="accent5" w:accent6="accent6" w:hyperlink="hyperlink" w:followedHyperlink="followedHyperlink"/>
+</w:settings>
+</file>
+
+<file path=word\styles.xml><?xml version="1.0" encoding="utf-8"?>
 <w:styles xmlns:mc="http://schemas.openxmlformats.org/markup-compatibility/2006" xmlns:o="urn:schemas-microsoft-com:office:office" xmlns:r="http://schemas.openxmlformats.org/officeDocument/2006/relationships" xmlns:m="http://schemas.openxmlformats.org/officeDocument/2006/math" xmlns:v="urn:schemas-microsoft-com:vml" xmlns:wp="http://schemas.openxmlformats.org/drawingml/2006/wordprocessingDrawing" xmlns:w10="urn:schemas-microsoft-com:office:word" xmlns:w="http://schemas.openxmlformats.org/wordprocessingml/2006/main" xmlns:wne="http://schemas.microsoft.com/office/word/2006/wordml" xmlns:sl="http://schemas.openxmlformats.org/schemaLibrary/2006/main" xmlns:a="http://schemas.openxmlformats.org/drawingml/2006/main" xmlns:pic="http://schemas.openxmlformats.org/drawingml/2006/picture" xmlns:c="http://schemas.openxmlformats.org/drawingml/2006/chart" xmlns:lc="http://schemas.openxmlformats.org/drawingml/2006/lockedCanvas" xmlns:dgm="http://schemas.openxmlformats.org/drawingml/2006/diagram" xmlns:wps="http://schemas.microsoft.com/office/word/2010/wordprocessingShape" xmlns:wpg="http://schemas.microsoft.com/office/word/2010/wordprocessingGroup" xmlns:w14="http://schemas.microsoft.com/office/word/2010/wordml" xmlns:w15="http://schemas.microsoft.com/office/word/2012/wordml" xmlns:w16="http://schemas.microsoft.com/office/word/2018/wordml" xmlns:w16cex="http://schemas.microsoft.com/office/word/2018/wordml/cex" xmlns:w16cid="http://schemas.microsoft.com/office/word/2016/wordml/cid" xmlns="http://schemas.microsoft.com/office/tasks/2019/documenttasks" xmlns:cr="http://schemas.microsoft.com/office/comments/2020/reactions">
   <w:docDefaults>
     <w:rPrDefault>
@@ -2202,7 +2219,7 @@
 </w:styles>
 </file>
 
-<file path=word/theme/theme1.xml><?xml version="1.0" encoding="utf-8"?>
+<file path=word\theme\theme1.xml><?xml version="1.0" encoding="utf-8"?>
 <a:theme xmlns:a="http://schemas.openxmlformats.org/drawingml/2006/main" name="Office Theme">
   <a:themeElements>
     <a:clrScheme name="Office">

</xml_diff>